<commit_message>
Update Pantocsekiella polymorpha from the revised 2026-10-06 Word file.
Spelling of Ács and Håkansson, striae/fultoportulae plurals, and
punctuation fixes; search index and static API regenerated.

Co-Authored-By: Claude Opus 5.5 <noreply@anthropic.com>
</commit_message>
<xml_diff>
--- a/data/raw/Pantocsekiella polymorpha 2026-10-06.docx
+++ b/data/raw/Pantocsekiella polymorpha 2026-10-06.docx
@@ -74,7 +74,25 @@
           <w:sz w:val="28"/>
           <w:szCs w:val="28"/>
         </w:rPr>
-        <w:t xml:space="preserve"> &amp; Acs 2016</w:t>
+        <w:t xml:space="preserve"> &amp; </w:t>
+      </w:r>
+      <w:r>
+        <w:rPr>
+          <w:rFonts w:ascii="Aptos" w:hAnsi="Aptos"/>
+          <w:color w:val="212121"/>
+        </w:rPr>
+        <w:t>Á</w:t>
+      </w:r>
+      <w:r>
+        <w:rPr>
+          <w:rFonts w:cstheme="majorBidi"/>
+          <w:b/>
+          <w:bCs/>
+          <w:color w:val="000000" w:themeColor="text1"/>
+          <w:sz w:val="28"/>
+          <w:szCs w:val="28"/>
+        </w:rPr>
+        <w:t>cs 2016</w:t>
       </w:r>
       <w:r>
         <w:rPr>
@@ -151,7 +169,25 @@
           <w:sz w:val="28"/>
           <w:szCs w:val="28"/>
         </w:rPr>
-        <w:t xml:space="preserve"> Meyer &amp; Hakansson 1996</w:t>
+        <w:t xml:space="preserve"> Meyer &amp; H</w:t>
+      </w:r>
+      <w:r>
+        <w:rPr>
+          <w:rFonts w:cstheme="majorBidi"/>
+          <w:color w:val="000000" w:themeColor="text1"/>
+        </w:rPr>
+        <w:t>å</w:t>
+      </w:r>
+      <w:r>
+        <w:rPr>
+          <w:rFonts w:cstheme="majorBidi"/>
+          <w:b/>
+          <w:bCs/>
+          <w:color w:val="000000" w:themeColor="text1"/>
+          <w:sz w:val="28"/>
+          <w:szCs w:val="28"/>
+        </w:rPr>
+        <w:t>kansson 1996</w:t>
       </w:r>
     </w:p>
     <w:p>
@@ -1003,7 +1039,21 @@
           <w:rFonts w:cstheme="majorBidi"/>
           <w:color w:val="000000" w:themeColor="text1"/>
         </w:rPr>
-        <w:t xml:space="preserve">(diameter: 5 - 16 </w:t>
+        <w:t>(diameter: 5</w:t>
+      </w:r>
+      <w:r>
+        <w:rPr>
+          <w:rFonts w:cstheme="majorBidi"/>
+          <w:color w:val="000000" w:themeColor="text1"/>
+        </w:rPr>
+        <w:t xml:space="preserve"> – </w:t>
+      </w:r>
+      <w:r>
+        <w:rPr>
+          <w:rFonts w:cstheme="majorBidi"/>
+          <w:color w:val="000000" w:themeColor="text1"/>
+        </w:rPr>
+        <w:t xml:space="preserve">16 </w:t>
       </w:r>
       <w:r>
         <w:rPr>
@@ -1180,7 +1230,28 @@
           <w:rFonts w:cstheme="majorBidi"/>
           <w:color w:val="000000" w:themeColor="text1"/>
         </w:rPr>
-        <w:t xml:space="preserve">, it was re-assigned by Kis </w:t>
+        <w:t xml:space="preserve">, it was re-assigned by </w:t>
+      </w:r>
+      <w:r>
+        <w:rPr>
+          <w:rFonts w:ascii="Aptos" w:hAnsi="Aptos"/>
+          <w:color w:val="212121"/>
+        </w:rPr>
+        <w:t>Á</w:t>
+      </w:r>
+      <w:r>
+        <w:rPr>
+          <w:rFonts w:cstheme="majorBidi"/>
+          <w:color w:val="000000" w:themeColor="text1"/>
+        </w:rPr>
+        <w:t>cs</w:t>
+      </w:r>
+      <w:r>
+        <w:rPr>
+          <w:rFonts w:cstheme="majorBidi"/>
+          <w:color w:val="000000" w:themeColor="text1"/>
+        </w:rPr>
+        <w:t xml:space="preserve"> </w:t>
       </w:r>
       <w:r>
         <w:rPr>
@@ -1322,6 +1393,13 @@
           <w:bCs/>
         </w:rPr>
         <w:t>fultoportula</w:t>
+      </w:r>
+      <w:r>
+        <w:rPr>
+          <w:b/>
+          <w:bCs/>
+        </w:rPr>
+        <w:t>e</w:t>
       </w:r>
       <w:r>
         <w:t xml:space="preserve"> scattered across the central area of the valve face. Fultoportulae are also present on the </w:t>
@@ -1662,6 +1740,15 @@
       <w:r>
         <w:rPr>
           <w:rFonts w:eastAsia="Times New Roman" w:cstheme="majorBidi"/>
+          <w:b/>
+          <w:bCs/>
+          <w:color w:val="000000" w:themeColor="text1"/>
+        </w:rPr>
+        <w:t>e</w:t>
+      </w:r>
+      <w:r>
+        <w:rPr>
+          <w:rFonts w:eastAsia="Times New Roman" w:cstheme="majorBidi"/>
           <w:color w:val="000000" w:themeColor="text1"/>
         </w:rPr>
         <w:t xml:space="preserve"> ("decoration</w:t>
@@ -2153,7 +2240,14 @@
           <w:rFonts w:eastAsia="Times New Roman" w:cstheme="majorBidi"/>
           <w:color w:val="000000" w:themeColor="text1"/>
         </w:rPr>
-        <w:t>, the maximum biomass ever attained was 40 g m</w:t>
+        <w:t>;</w:t>
+      </w:r>
+      <w:r>
+        <w:rPr>
+          <w:rFonts w:eastAsia="Times New Roman" w:cstheme="majorBidi"/>
+          <w:color w:val="000000" w:themeColor="text1"/>
+        </w:rPr>
+        <w:t xml:space="preserve"> the maximum biomass ever attained was 40 g m</w:t>
       </w:r>
       <w:r>
         <w:rPr>
@@ -2795,11 +2889,18 @@
       </w:pPr>
       <w:r>
         <w:rPr>
+          <w:rFonts w:ascii="Aptos" w:hAnsi="Aptos"/>
+          <w:color w:val="212121"/>
+        </w:rPr>
+        <w:t>Á</w:t>
+      </w:r>
+      <w:r>
+        <w:rPr>
           <w:rFonts w:cstheme="majorBidi"/>
           <w:color w:val="000000"/>
           <w:shd w:val="clear" w:color="auto" w:fill="EEEEEE"/>
         </w:rPr>
-        <w:t xml:space="preserve">Acs E, Ari E, </w:t>
+        <w:t xml:space="preserve">cs E, Ari E, </w:t>
       </w:r>
       <w:proofErr w:type="spellStart"/>
       <w:r>
@@ -2870,6 +2971,16 @@
           <w:shd w:val="clear" w:color="auto" w:fill="EEEEEE"/>
         </w:rPr>
         <w:t>Pantocsekiella</w:t>
+      </w:r>
+      <w:r>
+        <w:rPr>
+          <w:rFonts w:cstheme="majorBidi"/>
+          <w:i/>
+          <w:iCs/>
+          <w:color w:val="000000"/>
+          <w:shd w:val="clear" w:color="auto" w:fill="EEEEEE"/>
+        </w:rPr>
+        <w:t>,</w:t>
       </w:r>
       <w:r>
         <w:rPr>

</xml_diff>